<commit_message>
Update Master Degree Project Report Template-2026.docx
</commit_message>
<xml_diff>
--- a/Final report/Master Degree Project Report Template-2026.docx
+++ b/Final report/Master Degree Project Report Template-2026.docx
@@ -6180,7 +6180,62 @@
         <w:rPr>
           <w:rFonts w:asciiTheme="minorHAnsi" w:hAnsiTheme="minorHAnsi" w:cstheme="minorHAnsi"/>
         </w:rPr>
-        <w:t>Hospital readmission is an outcome with implications for patients, families, hospitals and health systems alike. An early return to hospital following discharge may indicate ongoing disease, complications, incomplete healing, inadequate discharge planning or inability to access external help. Readmission is not just a proxy for poor quality of care: it also results from illness severity, access to care, socioeconomic determinants and organization of health care services. Thus, a prediction model is capable of estimating risk within a certain data and services context, but it is not sufficient per se to identify preventable readmissions or show efficacy of any intervention.</w:t>
+        <w:t>Hospital readmission is an outcome with implications for patients, families, hospitals and health systems alike. An early return to hospital following discharge may indicate ongoing disease, complications, incomplete healing, inadequate discharge planning or inability to access external help</w:t>
+      </w:r>
+      <w:r>
+        <w:rPr>
+          <w:rFonts w:asciiTheme="minorHAnsi" w:hAnsiTheme="minorHAnsi" w:cstheme="minorHAnsi"/>
+        </w:rPr>
+        <w:t xml:space="preserve"> </w:t>
+      </w:r>
+      <w:sdt>
+        <w:sdtPr>
+          <w:rPr>
+            <w:rFonts w:asciiTheme="minorHAnsi" w:hAnsiTheme="minorHAnsi" w:cstheme="minorHAnsi"/>
+          </w:rPr>
+          <w:id w:val="880514669"/>
+          <w:citation/>
+        </w:sdtPr>
+        <w:sdtEndPr/>
+        <w:sdtContent>
+          <w:r>
+            <w:rPr>
+              <w:rFonts w:asciiTheme="minorHAnsi" w:hAnsiTheme="minorHAnsi" w:cstheme="minorHAnsi"/>
+            </w:rPr>
+            <w:fldChar w:fldCharType="begin"/>
+          </w:r>
+          <w:r>
+            <w:rPr>
+              <w:rFonts w:asciiTheme="minorHAnsi" w:hAnsiTheme="minorHAnsi" w:cstheme="minorHAnsi"/>
+            </w:rPr>
+            <w:instrText xml:space="preserve"> CITATION Abd24 \l 5129 </w:instrText>
+          </w:r>
+          <w:r>
+            <w:rPr>
+              <w:rFonts w:asciiTheme="minorHAnsi" w:hAnsiTheme="minorHAnsi" w:cstheme="minorHAnsi"/>
+            </w:rPr>
+            <w:fldChar w:fldCharType="separate"/>
+          </w:r>
+          <w:r>
+            <w:rPr>
+              <w:rFonts w:asciiTheme="minorHAnsi" w:hAnsiTheme="minorHAnsi" w:cstheme="minorHAnsi"/>
+              <w:noProof/>
+            </w:rPr>
+            <w:t>(Abdelhalim A, 2024)</w:t>
+          </w:r>
+          <w:r>
+            <w:rPr>
+              <w:rFonts w:asciiTheme="minorHAnsi" w:hAnsiTheme="minorHAnsi" w:cstheme="minorHAnsi"/>
+            </w:rPr>
+            <w:fldChar w:fldCharType="end"/>
+          </w:r>
+        </w:sdtContent>
+      </w:sdt>
+      <w:r>
+        <w:rPr>
+          <w:rFonts w:asciiTheme="minorHAnsi" w:hAnsiTheme="minorHAnsi" w:cstheme="minorHAnsi"/>
+        </w:rPr>
+        <w:t>. Readmission is not just a proxy for poor quality of care: it also results from illness severity, access to care, socioeconomic determinants and organization of health care services. Thus, a prediction model is capable of estimating risk within a certain data and services context, but it is not sufficient per se to identify preventable readmissions or show efficacy of any intervention.</w:t>
       </w:r>
     </w:p>
     <w:p>
@@ -6206,19 +6261,7 @@
         <w:rPr>
           <w:rFonts w:asciiTheme="minorHAnsi" w:hAnsiTheme="minorHAnsi" w:cstheme="minorHAnsi"/>
         </w:rPr>
-        <w:t xml:space="preserve">EHR data allow for incorporating demographics, diagnoses, medications, utilization and administrative variables into one dataset. It is still worth considering statistical regression models because they provide interpretable relationship between input and outcome variables. On the other hand, machine learning models have some apparent advantage in </w:t>
-      </w:r>
-      <w:r>
-        <w:rPr>
-          <w:rFonts w:asciiTheme="minorHAnsi" w:hAnsiTheme="minorHAnsi" w:cstheme="minorHAnsi"/>
-        </w:rPr>
-        <w:t>modelling</w:t>
-      </w:r>
-      <w:r>
-        <w:rPr>
-          <w:rFonts w:asciiTheme="minorHAnsi" w:hAnsiTheme="minorHAnsi" w:cstheme="minorHAnsi"/>
-        </w:rPr>
-        <w:t xml:space="preserve"> nonlinear relations and interactions. However, the latter depends on adequate definition of cohorts, model validation and outcomes. From the point of view of predictive performance, a model cannot be a clinical model without calibration, evaluation of subgroup errors and interpretation of results.</w:t>
+        <w:t>EHR data allow for incorporating demographics, diagnoses, medications, utilization and administrative variables into one dataset. It is still worth considering statistical regression models because they provide interpretable relationship between input and outcome variables. On the other hand, machine learning models have some apparent advantage in modelling nonlinear relations and interactions. However, the latter depends on adequate definition of cohorts, model validation and outcomes. From the point of view of predictive performance, a model cannot be a clinical model without calibration, evaluation of subgroup errors and interpretation of results.</w:t>
       </w:r>
     </w:p>
     <w:p>
@@ -6655,10 +6698,7 @@
         <w:ind w:left="2135" w:hanging="576"/>
       </w:pPr>
       <w:r>
-        <w:t>1.3.</w:t>
-      </w:r>
-      <w:r>
-        <w:t>2</w:t>
+        <w:t>1.3.2</w:t>
       </w:r>
       <w:r>
         <w:t xml:space="preserve"> Research Question 0</w:t>
@@ -6691,10 +6731,7 @@
         <w:ind w:left="2135" w:hanging="576"/>
       </w:pPr>
       <w:r>
-        <w:t>1.3.</w:t>
-      </w:r>
-      <w:r>
-        <w:t>3 R</w:t>
+        <w:t>1.3.3 R</w:t>
       </w:r>
       <w:r>
         <w:t>esearch Question 0</w:t>
@@ -6913,46 +6950,279 @@
         </w:rPr>
       </w:pPr>
     </w:p>
-    <w:p>
-      <w:pPr>
-        <w:pStyle w:val="BodyText"/>
-        <w:rPr>
-          <w:rFonts w:asciiTheme="minorHAnsi" w:hAnsiTheme="minorHAnsi" w:cstheme="minorHAnsi"/>
-        </w:rPr>
-      </w:pPr>
-    </w:p>
-    <w:p>
-      <w:pPr>
-        <w:pStyle w:val="BodyText"/>
-        <w:rPr>
-          <w:rFonts w:asciiTheme="minorHAnsi" w:hAnsiTheme="minorHAnsi" w:cstheme="minorHAnsi"/>
-        </w:rPr>
-      </w:pPr>
-    </w:p>
-    <w:p>
-      <w:pPr>
-        <w:pStyle w:val="BodyText"/>
-        <w:rPr>
-          <w:rFonts w:asciiTheme="minorHAnsi" w:hAnsiTheme="minorHAnsi" w:cstheme="minorHAnsi"/>
-        </w:rPr>
-      </w:pPr>
-    </w:p>
-    <w:p>
-      <w:pPr>
-        <w:pStyle w:val="BodyText"/>
-        <w:rPr>
-          <w:rFonts w:asciiTheme="minorHAnsi" w:hAnsiTheme="minorHAnsi" w:cstheme="minorHAnsi"/>
-        </w:rPr>
-      </w:pPr>
-    </w:p>
-    <w:p>
-      <w:pPr>
-        <w:pStyle w:val="BodyText"/>
-        <w:rPr>
-          <w:rFonts w:asciiTheme="minorHAnsi" w:hAnsiTheme="minorHAnsi" w:cstheme="minorHAnsi"/>
-        </w:rPr>
-      </w:pPr>
-    </w:p>
+    <w:tbl>
+      <w:tblPr>
+        <w:tblStyle w:val="TableGrid"/>
+        <w:tblW w:w="10915" w:type="dxa"/>
+        <w:tblInd w:w="-1139" w:type="dxa"/>
+        <w:tblLook w:val="04A0" w:firstRow="1" w:lastRow="0" w:firstColumn="1" w:lastColumn="0" w:noHBand="0" w:noVBand="1"/>
+      </w:tblPr>
+      <w:tblGrid>
+        <w:gridCol w:w="1985"/>
+        <w:gridCol w:w="3544"/>
+        <w:gridCol w:w="5386"/>
+      </w:tblGrid>
+      <w:tr>
+        <w:trPr>
+          <w:trHeight w:val="693"/>
+        </w:trPr>
+        <w:tc>
+          <w:tcPr>
+            <w:tcW w:w="1985" w:type="dxa"/>
+          </w:tcPr>
+          <w:p>
+            <w:pPr>
+              <w:pStyle w:val="BodyText"/>
+              <w:jc w:val="center"/>
+              <w:rPr>
+                <w:rFonts w:asciiTheme="minorHAnsi" w:hAnsiTheme="minorHAnsi" w:cstheme="minorHAnsi"/>
+                <w:b/>
+                <w:bCs/>
+                <w:szCs w:val="22"/>
+              </w:rPr>
+            </w:pPr>
+            <w:r>
+              <w:rPr>
+                <w:rFonts w:asciiTheme="minorHAnsi" w:hAnsiTheme="minorHAnsi" w:cstheme="minorHAnsi"/>
+                <w:b/>
+                <w:bCs/>
+                <w:szCs w:val="22"/>
+              </w:rPr>
+              <w:t>Research Question</w:t>
+            </w:r>
+          </w:p>
+        </w:tc>
+        <w:tc>
+          <w:tcPr>
+            <w:tcW w:w="3544" w:type="dxa"/>
+          </w:tcPr>
+          <w:p>
+            <w:pPr>
+              <w:pStyle w:val="BodyText"/>
+              <w:jc w:val="center"/>
+              <w:rPr>
+                <w:rFonts w:asciiTheme="minorHAnsi" w:hAnsiTheme="minorHAnsi" w:cstheme="minorHAnsi"/>
+                <w:b/>
+                <w:bCs/>
+                <w:szCs w:val="22"/>
+              </w:rPr>
+            </w:pPr>
+            <w:r>
+              <w:rPr>
+                <w:rFonts w:asciiTheme="minorHAnsi" w:hAnsiTheme="minorHAnsi" w:cstheme="minorHAnsi"/>
+                <w:b/>
+                <w:bCs/>
+                <w:szCs w:val="22"/>
+              </w:rPr>
+              <w:t>Main Objective</w:t>
+            </w:r>
+          </w:p>
+        </w:tc>
+        <w:tc>
+          <w:tcPr>
+            <w:tcW w:w="5386" w:type="dxa"/>
+          </w:tcPr>
+          <w:p>
+            <w:pPr>
+              <w:pStyle w:val="BodyText"/>
+              <w:jc w:val="center"/>
+              <w:rPr>
+                <w:rFonts w:asciiTheme="minorHAnsi" w:hAnsiTheme="minorHAnsi" w:cstheme="minorHAnsi"/>
+                <w:b/>
+                <w:bCs/>
+                <w:szCs w:val="22"/>
+              </w:rPr>
+            </w:pPr>
+            <w:r>
+              <w:rPr>
+                <w:rFonts w:asciiTheme="minorHAnsi" w:hAnsiTheme="minorHAnsi" w:cstheme="minorHAnsi"/>
+                <w:b/>
+                <w:bCs/>
+                <w:szCs w:val="22"/>
+              </w:rPr>
+              <w:t>Key Evidence</w:t>
+            </w:r>
+          </w:p>
+        </w:tc>
+      </w:tr>
+      <w:tr>
+        <w:tc>
+          <w:tcPr>
+            <w:tcW w:w="1985" w:type="dxa"/>
+          </w:tcPr>
+          <w:p>
+            <w:pPr>
+              <w:pStyle w:val="BodyText"/>
+              <w:rPr>
+                <w:rFonts w:asciiTheme="minorHAnsi" w:hAnsiTheme="minorHAnsi" w:cstheme="minorHAnsi"/>
+              </w:rPr>
+            </w:pPr>
+            <w:r>
+              <w:rPr>
+                <w:rFonts w:asciiTheme="minorHAnsi" w:hAnsiTheme="minorHAnsi" w:cstheme="minorHAnsi"/>
+              </w:rPr>
+              <w:t>RQ1</w:t>
+            </w:r>
+          </w:p>
+        </w:tc>
+        <w:tc>
+          <w:tcPr>
+            <w:tcW w:w="3544" w:type="dxa"/>
+          </w:tcPr>
+          <w:p>
+            <w:pPr>
+              <w:pStyle w:val="BodyText"/>
+              <w:rPr>
+                <w:rFonts w:asciiTheme="minorHAnsi" w:hAnsiTheme="minorHAnsi" w:cstheme="minorHAnsi"/>
+              </w:rPr>
+            </w:pPr>
+            <w:r>
+              <w:rPr>
+                <w:rFonts w:asciiTheme="minorHAnsi" w:hAnsiTheme="minorHAnsi" w:cstheme="minorHAnsi"/>
+              </w:rPr>
+              <w:t>Compare models and adapted LACE</w:t>
+            </w:r>
+          </w:p>
+        </w:tc>
+        <w:tc>
+          <w:tcPr>
+            <w:tcW w:w="5386" w:type="dxa"/>
+          </w:tcPr>
+          <w:p>
+            <w:pPr>
+              <w:pStyle w:val="BodyText"/>
+              <w:rPr>
+                <w:rFonts w:asciiTheme="minorHAnsi" w:hAnsiTheme="minorHAnsi" w:cstheme="minorHAnsi"/>
+              </w:rPr>
+            </w:pPr>
+            <w:r>
+              <w:rPr>
+                <w:rFonts w:asciiTheme="minorHAnsi" w:hAnsiTheme="minorHAnsi" w:cstheme="minorHAnsi"/>
+              </w:rPr>
+              <w:t>Held-out discrimination, calibration, threshold metrics, global feature importance</w:t>
+            </w:r>
+          </w:p>
+        </w:tc>
+      </w:tr>
+      <w:tr>
+        <w:tc>
+          <w:tcPr>
+            <w:tcW w:w="1985" w:type="dxa"/>
+          </w:tcPr>
+          <w:p>
+            <w:pPr>
+              <w:pStyle w:val="BodyText"/>
+              <w:rPr>
+                <w:rFonts w:asciiTheme="minorHAnsi" w:hAnsiTheme="minorHAnsi" w:cstheme="minorHAnsi"/>
+              </w:rPr>
+            </w:pPr>
+            <w:r>
+              <w:rPr>
+                <w:rFonts w:asciiTheme="minorHAnsi" w:hAnsiTheme="minorHAnsi" w:cstheme="minorHAnsi"/>
+              </w:rPr>
+              <w:t>RQ2</w:t>
+            </w:r>
+          </w:p>
+        </w:tc>
+        <w:tc>
+          <w:tcPr>
+            <w:tcW w:w="3544" w:type="dxa"/>
+          </w:tcPr>
+          <w:p>
+            <w:pPr>
+              <w:pStyle w:val="BodyText"/>
+              <w:rPr>
+                <w:rFonts w:asciiTheme="minorHAnsi" w:hAnsiTheme="minorHAnsi" w:cstheme="minorHAnsi"/>
+              </w:rPr>
+            </w:pPr>
+            <w:r>
+              <w:rPr>
+                <w:rFonts w:asciiTheme="minorHAnsi" w:hAnsiTheme="minorHAnsi" w:cstheme="minorHAnsi"/>
+              </w:rPr>
+              <w:t>Assess subgroup performance and explanations</w:t>
+            </w:r>
+          </w:p>
+        </w:tc>
+        <w:tc>
+          <w:tcPr>
+            <w:tcW w:w="5386" w:type="dxa"/>
+          </w:tcPr>
+          <w:p>
+            <w:pPr>
+              <w:pStyle w:val="BodyText"/>
+              <w:rPr>
+                <w:rFonts w:asciiTheme="minorHAnsi" w:hAnsiTheme="minorHAnsi" w:cstheme="minorHAnsi"/>
+              </w:rPr>
+            </w:pPr>
+            <w:r>
+              <w:rPr>
+                <w:rFonts w:asciiTheme="minorHAnsi" w:hAnsiTheme="minorHAnsi" w:cstheme="minorHAnsi"/>
+              </w:rPr>
+              <w:t>Group TPR/FPR, uncertainty intervals, subgroup SHAP patterns</w:t>
+            </w:r>
+          </w:p>
+        </w:tc>
+      </w:tr>
+      <w:tr>
+        <w:tc>
+          <w:tcPr>
+            <w:tcW w:w="1985" w:type="dxa"/>
+          </w:tcPr>
+          <w:p>
+            <w:pPr>
+              <w:pStyle w:val="BodyText"/>
+              <w:rPr>
+                <w:rFonts w:asciiTheme="minorHAnsi" w:hAnsiTheme="minorHAnsi" w:cstheme="minorHAnsi"/>
+              </w:rPr>
+            </w:pPr>
+            <w:r>
+              <w:rPr>
+                <w:rFonts w:asciiTheme="minorHAnsi" w:hAnsiTheme="minorHAnsi" w:cstheme="minorHAnsi"/>
+              </w:rPr>
+              <w:t>RQ3</w:t>
+            </w:r>
+          </w:p>
+        </w:tc>
+        <w:tc>
+          <w:tcPr>
+            <w:tcW w:w="3544" w:type="dxa"/>
+          </w:tcPr>
+          <w:p>
+            <w:pPr>
+              <w:pStyle w:val="BodyText"/>
+              <w:rPr>
+                <w:rFonts w:asciiTheme="minorHAnsi" w:hAnsiTheme="minorHAnsi" w:cstheme="minorHAnsi"/>
+              </w:rPr>
+            </w:pPr>
+            <w:r>
+              <w:rPr>
+                <w:rFonts w:asciiTheme="minorHAnsi" w:hAnsiTheme="minorHAnsi" w:cstheme="minorHAnsi"/>
+              </w:rPr>
+              <w:t>Test mitigation methods and trade-offs</w:t>
+            </w:r>
+          </w:p>
+        </w:tc>
+        <w:tc>
+          <w:tcPr>
+            <w:tcW w:w="5386" w:type="dxa"/>
+          </w:tcPr>
+          <w:p>
+            <w:pPr>
+              <w:pStyle w:val="BodyText"/>
+              <w:rPr>
+                <w:rFonts w:asciiTheme="minorHAnsi" w:hAnsiTheme="minorHAnsi" w:cstheme="minorHAnsi"/>
+              </w:rPr>
+            </w:pPr>
+            <w:r>
+              <w:rPr>
+                <w:rFonts w:asciiTheme="minorHAnsi" w:hAnsiTheme="minorHAnsi" w:cstheme="minorHAnsi"/>
+              </w:rPr>
+              <w:t>Before/after fairness and performance measures; SHAP ranking changes</w:t>
+            </w:r>
+          </w:p>
+        </w:tc>
+      </w:tr>
+    </w:tbl>
     <w:p>
       <w:pPr>
         <w:pStyle w:val="BodyText"/>
@@ -7084,7 +7354,6 @@
           <w:noProof w:val="0"/>
           <w:color w:val="000000" w:themeColor="text1"/>
         </w:rPr>
-        <w:lastRenderedPageBreak/>
         <w:t>Significance of Study</w:t>
       </w:r>
       <w:bookmarkEnd w:id="20"/>
@@ -7100,6 +7369,29 @@
           <w:color w:val="000000" w:themeColor="text1"/>
         </w:rPr>
       </w:pPr>
+      <w:r>
+        <w:rPr>
+          <w:rFonts w:asciiTheme="minorHAnsi" w:hAnsiTheme="minorHAnsi" w:cstheme="minorHAnsi"/>
+          <w:color w:val="000000" w:themeColor="text1"/>
+        </w:rPr>
+        <w:t xml:space="preserve">The importance of this project is the multi-criteria evaluation </w:t>
+      </w:r>
+      <w:proofErr w:type="gramStart"/>
+      <w:r>
+        <w:rPr>
+          <w:rFonts w:asciiTheme="minorHAnsi" w:hAnsiTheme="minorHAnsi" w:cstheme="minorHAnsi"/>
+          <w:color w:val="000000" w:themeColor="text1"/>
+        </w:rPr>
+        <w:t>approach ,</w:t>
+      </w:r>
+      <w:proofErr w:type="gramEnd"/>
+      <w:r>
+        <w:rPr>
+          <w:rFonts w:asciiTheme="minorHAnsi" w:hAnsiTheme="minorHAnsi" w:cstheme="minorHAnsi"/>
+          <w:color w:val="000000" w:themeColor="text1"/>
+        </w:rPr>
+        <w:t xml:space="preserve"> rather than the invention of a novel algorithm. The project includes six different techniques in a single reproducible experiment, which are the statistical benchmark, the nonlinear model that is intrinsically interpretable, the boosted-tree model, the reconstruction of a clinical score, the subgroup evaluation, probability calibration, and two fairness approaches. This design is capable of demonstrating the reasons why a slight increase in performance is not always sufficient to add more complexity to the model. Moreover, this approach allows the consequences of a fairness intervention to be quantified in test set metrics and not treated as a property of the method.</w:t>
+      </w:r>
     </w:p>
     <w:p>
       <w:pPr>
@@ -7110,76 +7402,13 @@
           <w:color w:val="000000" w:themeColor="text1"/>
         </w:rPr>
       </w:pPr>
-    </w:p>
-    <w:p>
-      <w:pPr>
-        <w:pStyle w:val="BodyText"/>
-        <w:jc w:val="both"/>
-        <w:rPr>
-          <w:rFonts w:asciiTheme="minorHAnsi" w:hAnsiTheme="minorHAnsi" w:cstheme="minorHAnsi"/>
-          <w:color w:val="000000" w:themeColor="text1"/>
-        </w:rPr>
-      </w:pPr>
-    </w:p>
-    <w:p>
-      <w:pPr>
-        <w:pStyle w:val="BodyText"/>
-        <w:jc w:val="both"/>
-        <w:rPr>
-          <w:rFonts w:asciiTheme="minorHAnsi" w:hAnsiTheme="minorHAnsi" w:cstheme="minorHAnsi"/>
-          <w:color w:val="000000" w:themeColor="text1"/>
-        </w:rPr>
-      </w:pPr>
-    </w:p>
-    <w:p>
-      <w:pPr>
-        <w:pStyle w:val="BodyText"/>
-        <w:jc w:val="both"/>
-        <w:rPr>
-          <w:rFonts w:asciiTheme="minorHAnsi" w:hAnsiTheme="minorHAnsi" w:cstheme="minorHAnsi"/>
-          <w:color w:val="000000" w:themeColor="text1"/>
-        </w:rPr>
-      </w:pPr>
-    </w:p>
-    <w:p>
-      <w:pPr>
-        <w:pStyle w:val="BodyText"/>
-        <w:jc w:val="both"/>
-        <w:rPr>
-          <w:rFonts w:asciiTheme="minorHAnsi" w:hAnsiTheme="minorHAnsi" w:cstheme="minorHAnsi"/>
-          <w:color w:val="000000" w:themeColor="text1"/>
-        </w:rPr>
-      </w:pPr>
-    </w:p>
-    <w:p>
-      <w:pPr>
-        <w:pStyle w:val="BodyText"/>
-        <w:jc w:val="both"/>
-        <w:rPr>
-          <w:rFonts w:asciiTheme="minorHAnsi" w:hAnsiTheme="minorHAnsi" w:cstheme="minorHAnsi"/>
-          <w:color w:val="000000" w:themeColor="text1"/>
-        </w:rPr>
-      </w:pPr>
-    </w:p>
-    <w:p>
-      <w:pPr>
-        <w:pStyle w:val="BodyText"/>
-        <w:jc w:val="both"/>
-        <w:rPr>
-          <w:rFonts w:asciiTheme="minorHAnsi" w:hAnsiTheme="minorHAnsi" w:cstheme="minorHAnsi"/>
-          <w:color w:val="000000" w:themeColor="text1"/>
-        </w:rPr>
-      </w:pPr>
-    </w:p>
-    <w:p>
-      <w:pPr>
-        <w:pStyle w:val="BodyText"/>
-        <w:jc w:val="both"/>
-        <w:rPr>
-          <w:rFonts w:asciiTheme="minorHAnsi" w:hAnsiTheme="minorHAnsi" w:cstheme="minorHAnsi"/>
-          <w:color w:val="000000" w:themeColor="text1"/>
-        </w:rPr>
-      </w:pPr>
+      <w:r>
+        <w:rPr>
+          <w:rFonts w:asciiTheme="minorHAnsi" w:hAnsiTheme="minorHAnsi" w:cstheme="minorHAnsi"/>
+          <w:color w:val="000000" w:themeColor="text1"/>
+        </w:rPr>
+        <w:t>The project is relevant to the responsible practice of AI due to the necessity to include the subgroup denominator, uncertainty, calibration, and the threshold selection. The results can be valuable for the future research workflows for clinical risk prediction, but this study does not represent a clinical tool.</w:t>
+      </w:r>
     </w:p>
     <w:p>
       <w:pPr>
@@ -7645,29 +7874,21 @@
       </w:r>
       <w:bookmarkStart w:id="29" w:name="_Toc177043263"/>
       <w:bookmarkEnd w:id="29"/>
-    </w:p>
-    <w:p>
-      <w:pPr>
-        <w:pStyle w:val="BodyText"/>
-        <w:rPr>
-          <w:rFonts w:asciiTheme="minorHAnsi" w:hAnsiTheme="minorHAnsi" w:cstheme="minorHAnsi"/>
-        </w:rPr>
-      </w:pPr>
-    </w:p>
-    <w:p>
-      <w:pPr>
-        <w:pStyle w:val="Heading2"/>
-        <w:numPr>
-          <w:ilvl w:val="0"/>
-          <w:numId w:val="0"/>
-        </w:numPr>
-        <w:ind w:left="2135" w:hanging="576"/>
-        <w:jc w:val="both"/>
-        <w:rPr>
-          <w:rFonts w:asciiTheme="minorHAnsi" w:hAnsiTheme="minorHAnsi" w:cstheme="minorHAnsi"/>
-        </w:rPr>
-      </w:pPr>
-    </w:p>
+      <w:r>
+        <w:rPr>
+          <w:rFonts w:asciiTheme="minorHAnsi" w:hAnsiTheme="minorHAnsi" w:cstheme="minorHAnsi"/>
+          <w:noProof w:val="0"/>
+          <w:color w:val="000000" w:themeColor="text1"/>
+        </w:rPr>
+        <w:t xml:space="preserve"> and Readmission Prediction</w:t>
+      </w:r>
+    </w:p>
+    <w:p>
+      <w:pPr>
+        <w:pStyle w:val="BodyText"/>
+      </w:pPr>
+    </w:p>
+    <w:p/>
     <w:p>
       <w:pPr>
         <w:pStyle w:val="BodyText"/>
@@ -19030,25 +19251,31 @@
 </file>
 
 <file path=customXml/item1.xml><?xml version="1.0" encoding="utf-8"?>
-<?mso-contentType ?>
-<FormTemplates xmlns="http://schemas.microsoft.com/sharepoint/v3/contenttype/forms">
-  <Display>DocumentLibraryForm</Display>
-  <Edit>DocumentLibraryForm</Edit>
-  <New>DocumentLibraryForm</New>
-</FormTemplates>
+<b:Sources xmlns:b="http://schemas.openxmlformats.org/officeDocument/2006/bibliography" xmlns="http://schemas.openxmlformats.org/officeDocument/2006/bibliography" SelectedStyle="\APA.XSL" StyleName="APA">
+  <b:Source>
+    <b:Tag>Abd24</b:Tag>
+    <b:SourceType>JournalArticle</b:SourceType>
+    <b:Guid>{A62E063C-62E8-4BED-A708-D1AE968B14A7}</b:Guid>
+    <b:Author>
+      <b:Author>
+        <b:NameList>
+          <b:Person>
+            <b:Last>Abdelhalim A</b:Last>
+            <b:First>Zargoush</b:First>
+            <b:Middle>M, Archer N, Roham M</b:Middle>
+          </b:Person>
+        </b:NameList>
+      </b:Author>
+    </b:Author>
+    <b:Title>Decoding the persistence of delayed hospital discharge: An in‐depth scoping review and insights from two decades.</b:Title>
+    <b:JournalName>Health Expectations</b:JournalName>
+    <b:Year>2024</b:Year>
+    <b:RefOrder>1</b:RefOrder>
+  </b:Source>
+</b:Sources>
 </file>
 
 <file path=customXml/item2.xml><?xml version="1.0" encoding="utf-8"?>
-<p:properties xmlns:p="http://schemas.microsoft.com/office/2006/metadata/properties" xmlns:xsi="http://www.w3.org/2001/XMLSchema-instance" xmlns:pc="http://schemas.microsoft.com/office/infopath/2007/PartnerControls">
-  <documentManagement/>
-</p:properties>
-</file>
-
-<file path=customXml/item3.xml><?xml version="1.0" encoding="utf-8"?>
-<b:Sources xmlns:b="http://schemas.openxmlformats.org/officeDocument/2006/bibliography" xmlns="http://schemas.openxmlformats.org/officeDocument/2006/bibliography" SelectedStyle="\APA.XSL" StyleName="APA"/>
-</file>
-
-<file path=customXml/item4.xml><?xml version="1.0" encoding="utf-8"?>
 <ct:contentTypeSchema xmlns:ct="http://schemas.microsoft.com/office/2006/metadata/contentType" xmlns:ma="http://schemas.microsoft.com/office/2006/metadata/properties/metaAttributes" ct:_="" ma:_="" ma:contentTypeName="Document" ma:contentTypeID="0x010100817B8106129F2246AF2B1259B895C2D7" ma:contentTypeVersion="6" ma:contentTypeDescription="Create a new document." ma:contentTypeScope="" ma:versionID="ed4eb9a771ad553cb06b3acbc461b5f0">
   <xsd:schema xmlns:xsd="http://www.w3.org/2001/XMLSchema" xmlns:xs="http://www.w3.org/2001/XMLSchema" xmlns:p="http://schemas.microsoft.com/office/2006/metadata/properties" xmlns:ns2="60aa78ec-00ab-4b3a-9f49-10f8c6d6eaa1" xmlns:ns3="ad1afe78-1879-40c3-9070-f8ff7f1daace" targetNamespace="http://schemas.microsoft.com/office/2006/metadata/properties" ma:root="true" ma:fieldsID="ac461e4c5396db5096b45c9dc816af8d" ns2:_="" ns3:_="">
     <xsd:import namespace="60aa78ec-00ab-4b3a-9f49-10f8c6d6eaa1"/>
@@ -19227,32 +19454,30 @@
 </ct:contentTypeSchema>
 </file>
 
-<file path=customXml/itemProps1.xml><?xml version="1.0" encoding="utf-8"?>
-<ds:datastoreItem xmlns:ds="http://schemas.openxmlformats.org/officeDocument/2006/customXml" ds:itemID="{E13B00D0-4464-49DF-A713-16546C7E612B}">
-  <ds:schemaRefs>
-    <ds:schemaRef ds:uri="http://schemas.microsoft.com/sharepoint/v3/contenttype/forms"/>
-  </ds:schemaRefs>
-</ds:datastoreItem>
+<file path=customXml/item3.xml><?xml version="1.0" encoding="utf-8"?>
+<?mso-contentType ?>
+<FormTemplates xmlns="http://schemas.microsoft.com/sharepoint/v3/contenttype/forms">
+  <Display>DocumentLibraryForm</Display>
+  <Edit>DocumentLibraryForm</Edit>
+  <New>DocumentLibraryForm</New>
+</FormTemplates>
 </file>
 
-<file path=customXml/itemProps2.xml><?xml version="1.0" encoding="utf-8"?>
-<ds:datastoreItem xmlns:ds="http://schemas.openxmlformats.org/officeDocument/2006/customXml" ds:itemID="{60239EEE-B424-4E88-BEFF-E13B330C2416}">
-  <ds:schemaRefs>
-    <ds:schemaRef ds:uri="http://schemas.microsoft.com/office/2006/metadata/properties"/>
-    <ds:schemaRef ds:uri="http://schemas.microsoft.com/office/infopath/2007/PartnerControls"/>
-  </ds:schemaRefs>
-</ds:datastoreItem>
+<file path=customXml/item4.xml><?xml version="1.0" encoding="utf-8"?>
+<p:properties xmlns:p="http://schemas.microsoft.com/office/2006/metadata/properties" xmlns:xsi="http://www.w3.org/2001/XMLSchema-instance" xmlns:pc="http://schemas.microsoft.com/office/infopath/2007/PartnerControls">
+  <documentManagement/>
+</p:properties>
 </file>
 
-<file path=customXml/itemProps3.xml><?xml version="1.0" encoding="utf-8"?>
-<ds:datastoreItem xmlns:ds="http://schemas.openxmlformats.org/officeDocument/2006/customXml" ds:itemID="{06707E8C-BE05-4452-B492-9E801D666DD5}">
+<file path=customXml/itemProps1.xml><?xml version="1.0" encoding="utf-8"?>
+<ds:datastoreItem xmlns:ds="http://schemas.openxmlformats.org/officeDocument/2006/customXml" ds:itemID="{12944592-BAC7-41A8-AEF5-B7495351C1EB}">
   <ds:schemaRefs>
     <ds:schemaRef ds:uri="http://schemas.openxmlformats.org/officeDocument/2006/bibliography"/>
   </ds:schemaRefs>
 </ds:datastoreItem>
 </file>
 
-<file path=customXml/itemProps4.xml><?xml version="1.0" encoding="utf-8"?>
+<file path=customXml/itemProps2.xml><?xml version="1.0" encoding="utf-8"?>
 <ds:datastoreItem xmlns:ds="http://schemas.openxmlformats.org/officeDocument/2006/customXml" ds:itemID="{D1F43195-A82B-47AE-8E08-A3A5DB855EDF}">
   <ds:schemaRefs>
     <ds:schemaRef ds:uri="http://schemas.microsoft.com/office/2006/metadata/contentType"/>
@@ -19269,4 +19494,21 @@
     <ds:schemaRef ds:uri="http://schemas.microsoft.com/internal/obd"/>
   </ds:schemaRefs>
 </ds:datastoreItem>
+</file>
+
+<file path=customXml/itemProps3.xml><?xml version="1.0" encoding="utf-8"?>
+<ds:datastoreItem xmlns:ds="http://schemas.openxmlformats.org/officeDocument/2006/customXml" ds:itemID="{E13B00D0-4464-49DF-A713-16546C7E612B}">
+  <ds:schemaRefs>
+    <ds:schemaRef ds:uri="http://schemas.microsoft.com/sharepoint/v3/contenttype/forms"/>
+  </ds:schemaRefs>
+</ds:datastoreItem>
+</file>
+
+<file path=customXml/itemProps4.xml><?xml version="1.0" encoding="utf-8"?>
+<ds:datastoreItem xmlns:ds="http://schemas.openxmlformats.org/officeDocument/2006/customXml" ds:itemID="{60239EEE-B424-4E88-BEFF-E13B330C2416}">
+  <ds:schemaRefs>
+    <ds:schemaRef ds:uri="http://schemas.microsoft.com/office/2006/metadata/properties"/>
+    <ds:schemaRef ds:uri="http://schemas.microsoft.com/office/infopath/2007/PartnerControls"/>
+  </ds:schemaRefs>
+</ds:datastoreItem>
 </file>
</xml_diff>